<commit_message>
Dodaj karty obecności xlsx, certyfikat recertyfikacji i zmienne exam_c/y w szablonach
- Nowy endpoint xlsx-per-enrollment generuje osobny arkusz dla każdego uczestnika
- Certyfikat recertyfikacji używa certyfikat.r.docx
- Zmienne szablonów: {{exam_c}} (miasto egzaminu), {{y}} (2 ostatnie cyfry roku)
- Pola cert_number/cert_date w panelu admina widoczne tylko dla kursów recertyfikacji

Co-Authored-By: Claude Sonnet 4.6 <noreply@anthropic.com>
</commit_message>
<xml_diff>
--- a/backend/documents/templates/certyfikat.docx
+++ b/backend/documents/templates/certyfikat.docx
@@ -620,7 +620,7 @@
           <w:sz w:val="28"/>
           <w:szCs w:val="28"/>
         </w:rPr>
-        <w:t>26</w:t>
+        <w:t>{{y}}</w:t>
       </w:r>
       <w:r>
         <w:rPr>
@@ -724,47 +724,25 @@
           <w:sz w:val="28"/>
           <w:szCs w:val="28"/>
         </w:rPr>
-        <w:t xml:space="preserve">        </w:t>
-      </w:r>
-      <w:r>
-        <w:rPr>
-          <w:rFonts w:ascii="Times New Roman" w:hAnsi="Times New Roman" w:cs="Times New Roman"/>
-          <w:sz w:val="28"/>
-          <w:szCs w:val="28"/>
-        </w:rPr>
-        <w:t xml:space="preserve">       </w:t>
-      </w:r>
-      <w:r>
-        <w:rPr>
-          <w:rFonts w:ascii="Times New Roman" w:hAnsi="Times New Roman" w:cs="Times New Roman"/>
-          <w:sz w:val="28"/>
-          <w:szCs w:val="28"/>
-        </w:rPr>
-        <w:t xml:space="preserve"> </w:t>
-      </w:r>
-      <w:r>
-        <w:rPr>
-          <w:rFonts w:ascii="Times New Roman" w:hAnsi="Times New Roman" w:cs="Times New Roman"/>
-          <w:sz w:val="28"/>
-          <w:szCs w:val="28"/>
-        </w:rPr>
-        <w:t xml:space="preserve"> </w:t>
-      </w:r>
-      <w:r>
-        <w:rPr>
-          <w:rFonts w:ascii="Times New Roman" w:hAnsi="Times New Roman" w:cs="Times New Roman"/>
-          <w:sz w:val="28"/>
-          <w:szCs w:val="28"/>
-        </w:rPr>
-        <w:t xml:space="preserve"> </w:t>
-      </w:r>
-      <w:r>
-        <w:rPr>
-          <w:rFonts w:ascii="Times New Roman" w:hAnsi="Times New Roman" w:cs="Times New Roman"/>
-          <w:sz w:val="28"/>
-          <w:szCs w:val="28"/>
-        </w:rPr>
-        <w:t>Pisz</w:t>
+        <w:t>{{</w:t>
+      </w:r>
+      <w:proofErr w:type="spellStart"/>
+      <w:r>
+        <w:rPr>
+          <w:rFonts w:ascii="Times New Roman" w:hAnsi="Times New Roman" w:cs="Times New Roman"/>
+          <w:sz w:val="28"/>
+          <w:szCs w:val="28"/>
+        </w:rPr>
+        <w:t>exam_c</w:t>
+      </w:r>
+      <w:proofErr w:type="spellEnd"/>
+      <w:r>
+        <w:rPr>
+          <w:rFonts w:ascii="Times New Roman" w:hAnsi="Times New Roman" w:cs="Times New Roman"/>
+          <w:sz w:val="28"/>
+          <w:szCs w:val="28"/>
+        </w:rPr>
+        <w:t>}}</w:t>
       </w:r>
       <w:r>
         <w:rPr>

</xml_diff>